<commit_message>
Belge arşivi: öğretmenler kurulu tutanakları 2026.09.1
Sene başı tutanağında (GNL-OKR-OKT-001, 13. gündem) "kurulda doldurulacak
alanlar" çizelgesi genel sürümde okula özel değerler taşıyordu; satırlar
doldurulacak alana alındı: nöbet yerleri, değişim sıklığı, kantin gözetimi,
öğrenci nöbeti. "Devre saatleri" satırı "Ders saatleri" oldu (genel sürüm
tam gün öğretime göre), okula özgü "bodrum kat" satırı çıkarıldı.
Diğer üç belgede yalnız sürüm ibaresi değişti.

Co-Authored-By: Claude Opus 5 <noreply@anthropic.com>
</commit_message>
<xml_diff>
--- a/public/evrak/ogretmenler-kurulu-tutanaklari/GNL-OKR-OKT-001_Sene_Basi_Ogretmenler_Kurulu_Cerceve_Tutanagi_2026-2027_v1.0.docx
+++ b/public/evrak/ogretmenler-kurulu-tutanaklari/GNL-OKR-OKT-001_Sene_Basi_Ogretmenler_Kurulu_Cerceve_Tutanagi_2026-2027_v1.0.docx
@@ -264,7 +264,7 @@
                 <w:i w:val="0"/>
                 <w:sz w:val="18"/>
               </w:rPr>
-              <w:t>• Bu belge, okulapp.org üzerinde yayımlanan GENEL TUTANAK ŞABLONU setinin parçasıdır (sürüm: 2026.09 (14.09.2026)). Resmî bir Bakanlık belgesi değildir; okulun şartlarına ve toplantıda gerçekten görüşülen hususlara göre uyarlanır. Metindeki mevzuat atıfları 28.08.2026 tarihi itibarıyla yürürlükteki hükümlere göre yazılmıştır; kullanmadan önce güncelliği kontrol ediniz. Lisans: CC BY 4.0 — kaynak gösterilerek kullanılabilir ve uyarlanabilir.</w:t>
+              <w:t>• Bu belge, okulapp.org üzerinde yayımlanan GENEL TUTANAK ŞABLONU setinin parçasıdır (sürüm: 2026.09.1 (22.09.2026)). Resmî bir Bakanlık belgesi değildir; okulun şartlarına ve toplantıda gerçekten görüşülen hususlara göre uyarlanır. Metindeki mevzuat atıfları 28.08.2026 tarihi itibarıyla yürürlükteki hükümlere göre yazılmıştır; kullanmadan önce güncelliği kontrol ediniz. Lisans: CC BY 4.0 — kaynak gösterilerek kullanılabilir ve uyarlanabilir.</w:t>
             </w:r>
           </w:p>
           <w:p>
@@ -17133,9 +17133,27 @@
               <w:rPr>
                 <w:b w:val="0"/>
                 <w:i w:val="0"/>
-                <w:sz w:val="18"/>
-              </w:rPr>
-              <w:t>Bahçe (iki nöbetçi) · Giriş kat · Bodrum kat · 1., 2., 3. ve 4. kat (her birine bir nöbetçi); hafta içi 13.00-17.00 arası kurs nöbetçisi</w:t>
+                <w:color w:val="C00000"/>
+                <w:sz w:val="18"/>
+              </w:rPr>
+              <w:t>[nöbet yerleri ve her birine düşen nöbetçi sayısı: … ]</w:t>
+            </w:r>
+            <w:r>
+              <w:rPr>
+                <w:b w:val="0"/>
+                <w:i w:val="0"/>
+                <w:sz w:val="18"/>
+              </w:rPr>
+              <w:t xml:space="preserve">; kurs ve etüt saatlerinde </w:t>
+            </w:r>
+            <w:r>
+              <w:rPr>
+                <w:b w:val="0"/>
+                <w:i w:val="0"/>
+                <w:color w:val="C00000"/>
+                <w:sz w:val="18"/>
+              </w:rPr>
+              <w:t>[…………………………………………]</w:t>
             </w:r>
           </w:p>
         </w:tc>
@@ -17167,9 +17185,18 @@
               <w:rPr>
                 <w:b w:val="0"/>
                 <w:i w:val="0"/>
-                <w:sz w:val="18"/>
-              </w:rPr>
-              <w:t>Ayda bir; çizelge aylık düzenlenir ve her ayın başlangıcından önce müdür onayına sunulur</w:t>
+                <w:color w:val="C00000"/>
+                <w:sz w:val="18"/>
+              </w:rPr>
+              <w:t>[……………………]</w:t>
+            </w:r>
+            <w:r>
+              <w:rPr>
+                <w:b w:val="0"/>
+                <w:i w:val="0"/>
+                <w:sz w:val="18"/>
+              </w:rPr>
+              <w:t xml:space="preserve"> dönemlerle; çizelge aylık düzenlenir ve her ayın başlangıcından önce müdür onayına sunulur</w:t>
             </w:r>
           </w:p>
         </w:tc>
@@ -17187,7 +17214,7 @@
                 <w:i w:val="0"/>
                 <w:sz w:val="18"/>
               </w:rPr>
-              <w:t>Kantin nöbeti</w:t>
+              <w:t>Kantin gözetimi</w:t>
             </w:r>
           </w:p>
         </w:tc>
@@ -17201,9 +17228,10 @@
               <w:rPr>
                 <w:b w:val="0"/>
                 <w:i w:val="0"/>
-                <w:sz w:val="18"/>
-              </w:rPr>
-              <w:t>Ayrı kantin nöbeti tutulmaz; kantin giriş katta olduğundan gözetimi giriş kat nöbetçisine aittir</w:t>
+                <w:color w:val="C00000"/>
+                <w:sz w:val="18"/>
+              </w:rPr>
+              <w:t>[…………………………………………]</w:t>
             </w:r>
           </w:p>
         </w:tc>
@@ -17221,7 +17249,7 @@
                 <w:i w:val="0"/>
                 <w:sz w:val="18"/>
               </w:rPr>
-              <w:t>Devre saatleri</w:t>
+              <w:t>Ders saatleri</w:t>
             </w:r>
           </w:p>
         </w:tc>
@@ -17307,7 +17335,7 @@
                 <w:i w:val="0"/>
                 <w:sz w:val="18"/>
               </w:rPr>
-              <w:t>Bodrum kat alanlarının adı</w:t>
+              <w:t>Öğrenci nöbeti</w:t>
             </w:r>
           </w:p>
         </w:tc>
@@ -17324,41 +17352,32 @@
                 <w:color w:val="C00000"/>
                 <w:sz w:val="18"/>
               </w:rPr>
+              <w:t>[öğrenci nöbet yerleri ve her birine düşen öğrenci sayısı: … ]</w:t>
+            </w:r>
+            <w:r>
+              <w:rPr>
+                <w:b w:val="0"/>
+                <w:i w:val="0"/>
+                <w:sz w:val="18"/>
+              </w:rPr>
+              <w:t xml:space="preserve">; varsa kütüphane nöbeti </w:t>
+            </w:r>
+            <w:r>
+              <w:rPr>
+                <w:b w:val="0"/>
+                <w:i w:val="0"/>
+                <w:color w:val="C00000"/>
+                <w:sz w:val="18"/>
+              </w:rPr>
               <w:t>[…………………………………………]</w:t>
             </w:r>
-          </w:p>
-        </w:tc>
-      </w:tr>
-      <w:tr>
-        <w:tc>
-          <w:tcPr>
-            <w:tcW w:w="2608" w:type="dxa"/>
-          </w:tcPr>
-          <w:p>
-            <w:r/>
-            <w:r>
-              <w:rPr>
-                <w:b w:val="0"/>
-                <w:i w:val="0"/>
-                <w:sz w:val="18"/>
-              </w:rPr>
-              <w:t>Öğrenci nöbeti</w:t>
-            </w:r>
-          </w:p>
-        </w:tc>
-        <w:tc>
-          <w:tcPr>
-            <w:tcW w:w="7483" w:type="dxa"/>
-          </w:tcPr>
-          <w:p>
-            <w:r/>
-            <w:r>
-              <w:rPr>
-                <w:b w:val="0"/>
-                <w:i w:val="0"/>
-                <w:sz w:val="18"/>
-              </w:rPr>
-              <w:t>Güvenlik (iki öğrenci) ile 1., 2., 3. ve 4. kat (her birine bir öğrenci); ayrıca kütüphane nöbeti ilgili kulüpçe belirlenir ve aylık çizelgesi müdür onayına sunulur</w:t>
+            <w:r>
+              <w:rPr>
+                <w:b w:val="0"/>
+                <w:i w:val="0"/>
+                <w:sz w:val="18"/>
+              </w:rPr>
+              <w:t xml:space="preserve"> tarafından belirlenir ve aylık çizelgesi müdür onayına sunulur</w:t>
             </w:r>
           </w:p>
         </w:tc>

</xml_diff>